<commit_message>
feat: persisted company profile + docx placeholder substitution (#FEAT-20260518-02)
- Add company_profile singleton table (V14 Flyway migration)
- CompanyProfileResolver wires persisted data into docx/pdf generation ahead of YAML fallback
- GET/PUT /api/v1/settings/company endpoint with full validation
- Company Profile settings page at /settings/company (react-hook-form + zod)
- Sidebar Company Profile link (Building2 icon)
- Updated invoice-template.docx with {{companyName}}, {{clientName}}, {{lines}} etc. tokens
- docs/INVOICE_TEMPLATE.md placeholder catalogue

Plan: .features/FEAT-20260518-02/PLAN.md
Review: pass
Security: pass
QA: pass

Co-Authored-By: Claude Sonnet 4.6 <noreply@anthropic.com>
</commit_message>
<xml_diff>
--- a/backend/src/main/resources/templates/invoice-template.docx
+++ b/backend/src/main/resources/templates/invoice-template.docx
@@ -47,7 +47,7 @@
                 <w:sz w:val="32"/>
                 <w:szCs w:val="32"/>
               </w:rPr>
-              <w:t>[Company Name]</w:t>
+              <w:t>{{companyName}}</w:t>
             </w:r>
           </w:p>
         </w:tc>
@@ -150,7 +150,7 @@
                 <w:sz w:val="20"/>
                 <w:szCs w:val="20"/>
               </w:rPr>
-              <w:t>[Street Address]</w:t>
+              <w:t>{{companyAddress}}</w:t>
             </w:r>
           </w:p>
         </w:tc>
@@ -238,7 +238,7 @@
                 <w:sz w:val="20"/>
                 <w:szCs w:val="20"/>
               </w:rPr>
-              <w:t>[City, ST  ZIP]</w:t>
+              <w:t>{{companyPhone}}</w:t>
             </w:r>
           </w:p>
         </w:tc>
@@ -468,7 +468,7 @@
                 <w:sz w:val="20"/>
                 <w:szCs w:val="20"/>
               </w:rPr>
-              <w:t>2034</w:t>
+              <w:t>{{invoiceNumber}}</w:t>
             </w:r>
           </w:p>
         </w:tc>
@@ -502,7 +502,7 @@
                 <w:sz w:val="20"/>
                 <w:szCs w:val="20"/>
               </w:rPr>
-              <w:t>5/1/2014</w:t>
+              <w:t>{{invoiceIssueDate}}</w:t>
             </w:r>
           </w:p>
         </w:tc>
@@ -708,7 +708,7 @@
                 <w:sz w:val="20"/>
                 <w:szCs w:val="20"/>
               </w:rPr>
-              <w:t>Net 30 Days</w:t>
+              <w:t>{{invoiceDueDate}}</w:t>
             </w:r>
           </w:p>
         </w:tc>
@@ -1005,7 +1005,7 @@
                 <w:sz w:val="20"/>
                 <w:szCs w:val="20"/>
               </w:rPr>
-              <w:t>[Name]</w:t>
+              <w:t>{{clientName}}</w:t>
             </w:r>
           </w:p>
         </w:tc>
@@ -1063,7 +1063,6 @@
                 <w:sz w:val="20"/>
                 <w:szCs w:val="20"/>
               </w:rPr>
-              <w:t>[Name]</w:t>
             </w:r>
           </w:p>
         </w:tc>
@@ -1101,7 +1100,7 @@
                 <w:sz w:val="20"/>
                 <w:szCs w:val="20"/>
               </w:rPr>
-              <w:t>[Company Name]</w:t>
+              <w:t>{{clientAddress}}</w:t>
             </w:r>
           </w:p>
         </w:tc>
@@ -1159,7 +1158,6 @@
                 <w:sz w:val="20"/>
                 <w:szCs w:val="20"/>
               </w:rPr>
-              <w:t>[Company Name]</w:t>
             </w:r>
           </w:p>
         </w:tc>
@@ -1197,7 +1195,7 @@
                 <w:sz w:val="20"/>
                 <w:szCs w:val="20"/>
               </w:rPr>
-              <w:t>[Street Address]</w:t>
+              <w:t>{{clientEmail}}</w:t>
             </w:r>
           </w:p>
         </w:tc>
@@ -1255,7 +1253,6 @@
                 <w:sz w:val="20"/>
                 <w:szCs w:val="20"/>
               </w:rPr>
-              <w:t>[Street Address]</w:t>
             </w:r>
           </w:p>
         </w:tc>
@@ -1293,7 +1290,6 @@
                 <w:sz w:val="20"/>
                 <w:szCs w:val="20"/>
               </w:rPr>
-              <w:t>[City, ST  ZIP]</w:t>
             </w:r>
           </w:p>
         </w:tc>
@@ -1351,7 +1347,6 @@
                 <w:sz w:val="20"/>
                 <w:szCs w:val="20"/>
               </w:rPr>
-              <w:t>[City, ST  ZIP]</w:t>
             </w:r>
           </w:p>
         </w:tc>
@@ -1389,7 +1384,6 @@
                 <w:sz w:val="20"/>
                 <w:szCs w:val="20"/>
               </w:rPr>
-              <w:t>[Phone]</w:t>
             </w:r>
           </w:p>
         </w:tc>
@@ -1447,7 +1441,6 @@
                 <w:sz w:val="20"/>
                 <w:szCs w:val="20"/>
               </w:rPr>
-              <w:t>[Phone]</w:t>
             </w:r>
           </w:p>
         </w:tc>
@@ -1486,7 +1479,6 @@
                 <w:sz w:val="20"/>
                 <w:szCs w:val="20"/>
               </w:rPr>
-              <w:t>[Email Address]</w:t>
             </w:r>
           </w:p>
         </w:tc>
@@ -1513,6 +1505,7 @@
                 <w:szCs w:val="20"/>
               </w:rPr>
             </w:pPr>
+            <w:r/>
           </w:p>
         </w:tc>
       </w:tr>
@@ -1718,7 +1711,7 @@
                 <w:sz w:val="20"/>
                 <w:szCs w:val="20"/>
               </w:rPr>
-              <w:t>Service Fee</w:t>
+              <w:t>{{lines}}</w:t>
             </w:r>
           </w:p>
         </w:tc>
@@ -1752,7 +1745,6 @@
                 <w:sz w:val="20"/>
                 <w:szCs w:val="20"/>
               </w:rPr>
-              <w:t>1</w:t>
             </w:r>
           </w:p>
         </w:tc>
@@ -1786,7 +1778,6 @@
                 <w:sz w:val="20"/>
                 <w:szCs w:val="20"/>
               </w:rPr>
-              <w:t>200.00</w:t>
             </w:r>
           </w:p>
         </w:tc>
@@ -1820,7 +1811,6 @@
                 <w:sz w:val="20"/>
                 <w:szCs w:val="20"/>
               </w:rPr>
-              <w:t xml:space="preserve">      200.00 </w:t>
             </w:r>
           </w:p>
         </w:tc>
@@ -1858,7 +1848,7 @@
                 <w:sz w:val="20"/>
                 <w:szCs w:val="20"/>
               </w:rPr>
-              <w:t>Labor: 5 hours at $75/</w:t>
+              <w:t>{{description}}</w:t>
             </w:r>
             <w:proofErr w:type="spellStart"/>
             <w:r>
@@ -1867,7 +1857,6 @@
                 <w:sz w:val="20"/>
                 <w:szCs w:val="20"/>
               </w:rPr>
-              <w:t>hr</w:t>
             </w:r>
             <w:proofErr w:type="spellEnd"/>
           </w:p>
@@ -1902,7 +1891,7 @@
                 <w:sz w:val="20"/>
                 <w:szCs w:val="20"/>
               </w:rPr>
-              <w:t>5</w:t>
+              <w:t>{{quantity}}</w:t>
             </w:r>
           </w:p>
         </w:tc>
@@ -1936,7 +1925,7 @@
                 <w:sz w:val="20"/>
                 <w:szCs w:val="20"/>
               </w:rPr>
-              <w:t>75.00</w:t>
+              <w:t>{{unitPrice}}</w:t>
             </w:r>
           </w:p>
         </w:tc>
@@ -1970,1865 +1959,8 @@
                 <w:sz w:val="20"/>
                 <w:szCs w:val="20"/>
               </w:rPr>
-              <w:t xml:space="preserve">      375.00 </w:t>
-            </w:r>
-          </w:p>
-        </w:tc>
-      </w:tr>
-      <w:tr>
-        <w:trPr>
-          <w:trHeight w:val="285"/>
-        </w:trPr>
-        <w:tc>
-          <w:tcPr>
-            <w:tcW w:w="2687" w:type="pct"/>
-            <w:tcBorders>
-              <w:top w:val="nil"/>
-              <w:left w:val="single" w:sz="4" w:space="0" w:color="808080"/>
-              <w:bottom w:val="nil"/>
-              <w:right w:val="nil"/>
-            </w:tcBorders>
-            <w:shd w:val="clear" w:color="auto" w:fill="auto"/>
-            <w:noWrap/>
-            <w:vAlign w:val="center"/>
-            <w:hideMark/>
-          </w:tcPr>
-          <w:p>
-            <w:pPr>
-              <w:spacing w:after="0" w:line="240" w:lineRule="auto"/>
-              <w:rPr>
-                <w:rFonts w:ascii="Arial" w:eastAsia="Times New Roman" w:hAnsi="Arial" w:cs="Arial"/>
-                <w:sz w:val="20"/>
-                <w:szCs w:val="20"/>
-              </w:rPr>
-            </w:pPr>
-            <w:r>
-              <w:rPr>
-                <w:rFonts w:ascii="Arial" w:eastAsia="Times New Roman" w:hAnsi="Arial" w:cs="Arial"/>
-                <w:sz w:val="20"/>
-                <w:szCs w:val="20"/>
-              </w:rPr>
-              <w:t>New client discount</w:t>
-            </w:r>
-          </w:p>
-        </w:tc>
-        <w:tc>
-          <w:tcPr>
-            <w:tcW w:w="708" w:type="pct"/>
-            <w:tcBorders>
-              <w:top w:val="nil"/>
-              <w:left w:val="single" w:sz="4" w:space="0" w:color="808080"/>
-              <w:bottom w:val="nil"/>
-              <w:right w:val="single" w:sz="4" w:space="0" w:color="808080"/>
-            </w:tcBorders>
-            <w:shd w:val="clear" w:color="auto" w:fill="auto"/>
-            <w:noWrap/>
-            <w:vAlign w:val="center"/>
-            <w:hideMark/>
-          </w:tcPr>
-          <w:p>
-            <w:pPr>
-              <w:spacing w:after="0" w:line="240" w:lineRule="auto"/>
-              <w:jc w:val="center"/>
-              <w:rPr>
-                <w:rFonts w:ascii="Arial" w:eastAsia="Times New Roman" w:hAnsi="Arial" w:cs="Arial"/>
-                <w:sz w:val="20"/>
-                <w:szCs w:val="20"/>
-              </w:rPr>
-            </w:pPr>
-          </w:p>
-        </w:tc>
-        <w:tc>
-          <w:tcPr>
-            <w:tcW w:w="802" w:type="pct"/>
-            <w:tcBorders>
-              <w:top w:val="nil"/>
-              <w:left w:val="nil"/>
-              <w:bottom w:val="nil"/>
-              <w:right w:val="single" w:sz="4" w:space="0" w:color="808080"/>
-            </w:tcBorders>
-            <w:shd w:val="clear" w:color="auto" w:fill="auto"/>
-            <w:noWrap/>
-            <w:vAlign w:val="center"/>
-            <w:hideMark/>
-          </w:tcPr>
-          <w:p>
-            <w:pPr>
-              <w:spacing w:after="0" w:line="240" w:lineRule="auto"/>
-              <w:jc w:val="center"/>
-              <w:rPr>
-                <w:rFonts w:ascii="Arial" w:eastAsia="Times New Roman" w:hAnsi="Arial" w:cs="Arial"/>
-                <w:sz w:val="20"/>
-                <w:szCs w:val="20"/>
-              </w:rPr>
-            </w:pPr>
-            <w:r>
-              <w:rPr>
-                <w:rFonts w:ascii="Arial" w:eastAsia="Times New Roman" w:hAnsi="Arial" w:cs="Arial"/>
-                <w:sz w:val="20"/>
-                <w:szCs w:val="20"/>
-              </w:rPr>
-              <w:t>(50.00)</w:t>
-            </w:r>
-          </w:p>
-        </w:tc>
-        <w:tc>
-          <w:tcPr>
-            <w:tcW w:w="802" w:type="pct"/>
-            <w:tcBorders>
-              <w:top w:val="nil"/>
-              <w:left w:val="nil"/>
-              <w:bottom w:val="nil"/>
-              <w:right w:val="single" w:sz="4" w:space="0" w:color="808080"/>
-            </w:tcBorders>
-            <w:shd w:val="clear" w:color="auto" w:fill="auto"/>
-            <w:noWrap/>
-            <w:vAlign w:val="center"/>
-            <w:hideMark/>
-          </w:tcPr>
-          <w:p>
-            <w:pPr>
-              <w:spacing w:after="0" w:line="240" w:lineRule="auto"/>
-              <w:jc w:val="right"/>
-              <w:rPr>
-                <w:rFonts w:ascii="Arial" w:eastAsia="Times New Roman" w:hAnsi="Arial" w:cs="Arial"/>
-                <w:sz w:val="20"/>
-                <w:szCs w:val="20"/>
-              </w:rPr>
-            </w:pPr>
-            <w:r>
-              <w:rPr>
-                <w:rFonts w:ascii="Arial" w:eastAsia="Times New Roman" w:hAnsi="Arial" w:cs="Arial"/>
-                <w:sz w:val="20"/>
-                <w:szCs w:val="20"/>
-              </w:rPr>
-              <w:t xml:space="preserve">      (50.00)</w:t>
-            </w:r>
-          </w:p>
-        </w:tc>
-      </w:tr>
-      <w:tr>
-        <w:trPr>
-          <w:trHeight w:val="285"/>
-        </w:trPr>
-        <w:tc>
-          <w:tcPr>
-            <w:tcW w:w="2687" w:type="pct"/>
-            <w:tcBorders>
-              <w:top w:val="nil"/>
-              <w:left w:val="single" w:sz="4" w:space="0" w:color="808080"/>
-              <w:bottom w:val="nil"/>
-              <w:right w:val="nil"/>
-            </w:tcBorders>
-            <w:shd w:val="clear" w:color="auto" w:fill="auto"/>
-            <w:noWrap/>
-            <w:vAlign w:val="center"/>
-            <w:hideMark/>
-          </w:tcPr>
-          <w:p>
-            <w:pPr>
-              <w:spacing w:after="0" w:line="240" w:lineRule="auto"/>
-              <w:rPr>
-                <w:rFonts w:ascii="Arial" w:eastAsia="Times New Roman" w:hAnsi="Arial" w:cs="Arial"/>
-                <w:sz w:val="20"/>
-                <w:szCs w:val="20"/>
-              </w:rPr>
-            </w:pPr>
-            <w:r>
-              <w:rPr>
-                <w:rFonts w:ascii="Arial" w:eastAsia="Times New Roman" w:hAnsi="Arial" w:cs="Arial"/>
-                <w:sz w:val="20"/>
-                <w:szCs w:val="20"/>
-              </w:rPr>
-              <w:t> </w:t>
-            </w:r>
-          </w:p>
-        </w:tc>
-        <w:tc>
-          <w:tcPr>
-            <w:tcW w:w="708" w:type="pct"/>
-            <w:tcBorders>
-              <w:top w:val="nil"/>
-              <w:left w:val="single" w:sz="4" w:space="0" w:color="808080"/>
-              <w:bottom w:val="nil"/>
-              <w:right w:val="single" w:sz="4" w:space="0" w:color="808080"/>
-            </w:tcBorders>
-            <w:shd w:val="clear" w:color="auto" w:fill="auto"/>
-            <w:noWrap/>
-            <w:vAlign w:val="center"/>
-            <w:hideMark/>
-          </w:tcPr>
-          <w:p>
-            <w:pPr>
-              <w:spacing w:after="0" w:line="240" w:lineRule="auto"/>
-              <w:jc w:val="center"/>
-              <w:rPr>
-                <w:rFonts w:ascii="Arial" w:eastAsia="Times New Roman" w:hAnsi="Arial" w:cs="Arial"/>
-                <w:sz w:val="20"/>
-                <w:szCs w:val="20"/>
-              </w:rPr>
-            </w:pPr>
-          </w:p>
-        </w:tc>
-        <w:tc>
-          <w:tcPr>
-            <w:tcW w:w="802" w:type="pct"/>
-            <w:tcBorders>
-              <w:top w:val="nil"/>
-              <w:left w:val="nil"/>
-              <w:bottom w:val="nil"/>
-              <w:right w:val="single" w:sz="4" w:space="0" w:color="808080"/>
-            </w:tcBorders>
-            <w:shd w:val="clear" w:color="auto" w:fill="auto"/>
-            <w:noWrap/>
-            <w:vAlign w:val="center"/>
-            <w:hideMark/>
-          </w:tcPr>
-          <w:p>
-            <w:pPr>
-              <w:spacing w:after="0" w:line="240" w:lineRule="auto"/>
-              <w:jc w:val="center"/>
-              <w:rPr>
-                <w:rFonts w:ascii="Arial" w:eastAsia="Times New Roman" w:hAnsi="Arial" w:cs="Arial"/>
-                <w:sz w:val="20"/>
-                <w:szCs w:val="20"/>
-              </w:rPr>
-            </w:pPr>
-          </w:p>
-        </w:tc>
-        <w:tc>
-          <w:tcPr>
-            <w:tcW w:w="802" w:type="pct"/>
-            <w:tcBorders>
-              <w:top w:val="nil"/>
-              <w:left w:val="nil"/>
-              <w:bottom w:val="nil"/>
-              <w:right w:val="single" w:sz="4" w:space="0" w:color="808080"/>
-            </w:tcBorders>
-            <w:shd w:val="clear" w:color="auto" w:fill="auto"/>
-            <w:noWrap/>
-            <w:vAlign w:val="center"/>
-          </w:tcPr>
-          <w:p>
-            <w:pPr>
-              <w:spacing w:after="0" w:line="240" w:lineRule="auto"/>
-              <w:jc w:val="right"/>
-              <w:rPr>
-                <w:rFonts w:ascii="Arial" w:eastAsia="Times New Roman" w:hAnsi="Arial" w:cs="Arial"/>
-                <w:sz w:val="20"/>
-                <w:szCs w:val="20"/>
-              </w:rPr>
-            </w:pPr>
-          </w:p>
-        </w:tc>
-      </w:tr>
-      <w:tr>
-        <w:trPr>
-          <w:trHeight w:val="285"/>
-        </w:trPr>
-        <w:tc>
-          <w:tcPr>
-            <w:tcW w:w="2687" w:type="pct"/>
-            <w:tcBorders>
-              <w:top w:val="nil"/>
-              <w:left w:val="single" w:sz="4" w:space="0" w:color="808080"/>
-              <w:bottom w:val="nil"/>
-              <w:right w:val="nil"/>
-            </w:tcBorders>
-            <w:shd w:val="clear" w:color="auto" w:fill="auto"/>
-            <w:noWrap/>
-            <w:vAlign w:val="center"/>
-            <w:hideMark/>
-          </w:tcPr>
-          <w:p>
-            <w:pPr>
-              <w:spacing w:after="0" w:line="240" w:lineRule="auto"/>
-              <w:rPr>
-                <w:rFonts w:ascii="Arial" w:eastAsia="Times New Roman" w:hAnsi="Arial" w:cs="Arial"/>
-                <w:sz w:val="20"/>
-                <w:szCs w:val="20"/>
-              </w:rPr>
-            </w:pPr>
-            <w:r>
-              <w:rPr>
-                <w:rFonts w:ascii="Arial" w:eastAsia="Times New Roman" w:hAnsi="Arial" w:cs="Arial"/>
-                <w:sz w:val="20"/>
-                <w:szCs w:val="20"/>
-              </w:rPr>
-              <w:t> </w:t>
-            </w:r>
-          </w:p>
-        </w:tc>
-        <w:tc>
-          <w:tcPr>
-            <w:tcW w:w="708" w:type="pct"/>
-            <w:tcBorders>
-              <w:top w:val="nil"/>
-              <w:left w:val="single" w:sz="4" w:space="0" w:color="808080"/>
-              <w:bottom w:val="nil"/>
-              <w:right w:val="single" w:sz="4" w:space="0" w:color="808080"/>
-            </w:tcBorders>
-            <w:shd w:val="clear" w:color="auto" w:fill="auto"/>
-            <w:noWrap/>
-            <w:vAlign w:val="center"/>
-            <w:hideMark/>
-          </w:tcPr>
-          <w:p>
-            <w:pPr>
-              <w:spacing w:after="0" w:line="240" w:lineRule="auto"/>
-              <w:jc w:val="center"/>
-              <w:rPr>
-                <w:rFonts w:ascii="Arial" w:eastAsia="Times New Roman" w:hAnsi="Arial" w:cs="Arial"/>
-                <w:sz w:val="20"/>
-                <w:szCs w:val="20"/>
-              </w:rPr>
-            </w:pPr>
-          </w:p>
-        </w:tc>
-        <w:tc>
-          <w:tcPr>
-            <w:tcW w:w="802" w:type="pct"/>
-            <w:tcBorders>
-              <w:top w:val="nil"/>
-              <w:left w:val="nil"/>
-              <w:bottom w:val="nil"/>
-              <w:right w:val="single" w:sz="4" w:space="0" w:color="808080"/>
-            </w:tcBorders>
-            <w:shd w:val="clear" w:color="auto" w:fill="auto"/>
-            <w:noWrap/>
-            <w:vAlign w:val="center"/>
-            <w:hideMark/>
-          </w:tcPr>
-          <w:p>
-            <w:pPr>
-              <w:spacing w:after="0" w:line="240" w:lineRule="auto"/>
-              <w:jc w:val="center"/>
-              <w:rPr>
-                <w:rFonts w:ascii="Arial" w:eastAsia="Times New Roman" w:hAnsi="Arial" w:cs="Arial"/>
-                <w:sz w:val="20"/>
-                <w:szCs w:val="20"/>
-              </w:rPr>
-            </w:pPr>
-          </w:p>
-        </w:tc>
-        <w:tc>
-          <w:tcPr>
-            <w:tcW w:w="802" w:type="pct"/>
-            <w:tcBorders>
-              <w:top w:val="nil"/>
-              <w:left w:val="nil"/>
-              <w:bottom w:val="nil"/>
-              <w:right w:val="single" w:sz="4" w:space="0" w:color="808080"/>
-            </w:tcBorders>
-            <w:shd w:val="clear" w:color="auto" w:fill="auto"/>
-            <w:noWrap/>
-            <w:vAlign w:val="center"/>
-          </w:tcPr>
-          <w:p>
-            <w:pPr>
-              <w:spacing w:after="0" w:line="240" w:lineRule="auto"/>
-              <w:jc w:val="right"/>
-              <w:rPr>
-                <w:rFonts w:ascii="Arial" w:eastAsia="Times New Roman" w:hAnsi="Arial" w:cs="Arial"/>
-                <w:sz w:val="20"/>
-                <w:szCs w:val="20"/>
-              </w:rPr>
-            </w:pPr>
-          </w:p>
-        </w:tc>
-      </w:tr>
-      <w:tr>
-        <w:trPr>
-          <w:trHeight w:val="285"/>
-        </w:trPr>
-        <w:tc>
-          <w:tcPr>
-            <w:tcW w:w="2687" w:type="pct"/>
-            <w:tcBorders>
-              <w:top w:val="nil"/>
-              <w:left w:val="single" w:sz="4" w:space="0" w:color="808080"/>
-              <w:bottom w:val="nil"/>
-              <w:right w:val="nil"/>
-            </w:tcBorders>
-            <w:shd w:val="clear" w:color="auto" w:fill="auto"/>
-            <w:noWrap/>
-            <w:vAlign w:val="center"/>
-            <w:hideMark/>
-          </w:tcPr>
-          <w:p>
-            <w:pPr>
-              <w:spacing w:after="0" w:line="240" w:lineRule="auto"/>
-              <w:rPr>
-                <w:rFonts w:ascii="Arial" w:eastAsia="Times New Roman" w:hAnsi="Arial" w:cs="Arial"/>
-                <w:sz w:val="20"/>
-                <w:szCs w:val="20"/>
-              </w:rPr>
-            </w:pPr>
-            <w:r>
-              <w:rPr>
-                <w:rFonts w:ascii="Arial" w:eastAsia="Times New Roman" w:hAnsi="Arial" w:cs="Arial"/>
-                <w:sz w:val="20"/>
-                <w:szCs w:val="20"/>
-              </w:rPr>
-              <w:t> </w:t>
-            </w:r>
-          </w:p>
-        </w:tc>
-        <w:tc>
-          <w:tcPr>
-            <w:tcW w:w="708" w:type="pct"/>
-            <w:tcBorders>
-              <w:top w:val="nil"/>
-              <w:left w:val="single" w:sz="4" w:space="0" w:color="808080"/>
-              <w:bottom w:val="nil"/>
-              <w:right w:val="single" w:sz="4" w:space="0" w:color="808080"/>
-            </w:tcBorders>
-            <w:shd w:val="clear" w:color="auto" w:fill="auto"/>
-            <w:noWrap/>
-            <w:vAlign w:val="center"/>
-            <w:hideMark/>
-          </w:tcPr>
-          <w:p>
-            <w:pPr>
-              <w:spacing w:after="0" w:line="240" w:lineRule="auto"/>
-              <w:jc w:val="center"/>
-              <w:rPr>
-                <w:rFonts w:ascii="Arial" w:eastAsia="Times New Roman" w:hAnsi="Arial" w:cs="Arial"/>
-                <w:sz w:val="20"/>
-                <w:szCs w:val="20"/>
-              </w:rPr>
-            </w:pPr>
-          </w:p>
-        </w:tc>
-        <w:tc>
-          <w:tcPr>
-            <w:tcW w:w="802" w:type="pct"/>
-            <w:tcBorders>
-              <w:top w:val="nil"/>
-              <w:left w:val="nil"/>
-              <w:bottom w:val="nil"/>
-              <w:right w:val="single" w:sz="4" w:space="0" w:color="808080"/>
-            </w:tcBorders>
-            <w:shd w:val="clear" w:color="auto" w:fill="auto"/>
-            <w:noWrap/>
-            <w:vAlign w:val="center"/>
-            <w:hideMark/>
-          </w:tcPr>
-          <w:p>
-            <w:pPr>
-              <w:spacing w:after="0" w:line="240" w:lineRule="auto"/>
-              <w:jc w:val="center"/>
-              <w:rPr>
-                <w:rFonts w:ascii="Arial" w:eastAsia="Times New Roman" w:hAnsi="Arial" w:cs="Arial"/>
-                <w:sz w:val="20"/>
-                <w:szCs w:val="20"/>
-              </w:rPr>
-            </w:pPr>
-          </w:p>
-        </w:tc>
-        <w:tc>
-          <w:tcPr>
-            <w:tcW w:w="802" w:type="pct"/>
-            <w:tcBorders>
-              <w:top w:val="nil"/>
-              <w:left w:val="nil"/>
-              <w:bottom w:val="nil"/>
-              <w:right w:val="single" w:sz="4" w:space="0" w:color="808080"/>
-            </w:tcBorders>
-            <w:shd w:val="clear" w:color="auto" w:fill="auto"/>
-            <w:noWrap/>
-            <w:vAlign w:val="center"/>
-          </w:tcPr>
-          <w:p>
-            <w:pPr>
-              <w:spacing w:after="0" w:line="240" w:lineRule="auto"/>
-              <w:jc w:val="right"/>
-              <w:rPr>
-                <w:rFonts w:ascii="Arial" w:eastAsia="Times New Roman" w:hAnsi="Arial" w:cs="Arial"/>
-                <w:sz w:val="20"/>
-                <w:szCs w:val="20"/>
-              </w:rPr>
-            </w:pPr>
-          </w:p>
-        </w:tc>
-      </w:tr>
-      <w:tr>
-        <w:trPr>
-          <w:trHeight w:val="285"/>
-        </w:trPr>
-        <w:tc>
-          <w:tcPr>
-            <w:tcW w:w="2687" w:type="pct"/>
-            <w:tcBorders>
-              <w:top w:val="nil"/>
-              <w:left w:val="single" w:sz="4" w:space="0" w:color="808080"/>
-              <w:bottom w:val="nil"/>
-              <w:right w:val="nil"/>
-            </w:tcBorders>
-            <w:shd w:val="clear" w:color="auto" w:fill="auto"/>
-            <w:noWrap/>
-            <w:vAlign w:val="center"/>
-            <w:hideMark/>
-          </w:tcPr>
-          <w:p>
-            <w:pPr>
-              <w:spacing w:after="0" w:line="240" w:lineRule="auto"/>
-              <w:rPr>
-                <w:rFonts w:ascii="Arial" w:eastAsia="Times New Roman" w:hAnsi="Arial" w:cs="Arial"/>
-                <w:sz w:val="20"/>
-                <w:szCs w:val="20"/>
-              </w:rPr>
-            </w:pPr>
-            <w:r>
-              <w:rPr>
-                <w:rFonts w:ascii="Arial" w:eastAsia="Times New Roman" w:hAnsi="Arial" w:cs="Arial"/>
-                <w:sz w:val="20"/>
-                <w:szCs w:val="20"/>
-              </w:rPr>
-              <w:t> </w:t>
-            </w:r>
-          </w:p>
-        </w:tc>
-        <w:tc>
-          <w:tcPr>
-            <w:tcW w:w="708" w:type="pct"/>
-            <w:tcBorders>
-              <w:top w:val="nil"/>
-              <w:left w:val="single" w:sz="4" w:space="0" w:color="808080"/>
-              <w:bottom w:val="nil"/>
-              <w:right w:val="single" w:sz="4" w:space="0" w:color="808080"/>
-            </w:tcBorders>
-            <w:shd w:val="clear" w:color="auto" w:fill="auto"/>
-            <w:noWrap/>
-            <w:vAlign w:val="center"/>
-            <w:hideMark/>
-          </w:tcPr>
-          <w:p>
-            <w:pPr>
-              <w:spacing w:after="0" w:line="240" w:lineRule="auto"/>
-              <w:jc w:val="center"/>
-              <w:rPr>
-                <w:rFonts w:ascii="Arial" w:eastAsia="Times New Roman" w:hAnsi="Arial" w:cs="Arial"/>
-                <w:sz w:val="20"/>
-                <w:szCs w:val="20"/>
-              </w:rPr>
-            </w:pPr>
-          </w:p>
-        </w:tc>
-        <w:tc>
-          <w:tcPr>
-            <w:tcW w:w="802" w:type="pct"/>
-            <w:tcBorders>
-              <w:top w:val="nil"/>
-              <w:left w:val="nil"/>
-              <w:bottom w:val="nil"/>
-              <w:right w:val="single" w:sz="4" w:space="0" w:color="808080"/>
-            </w:tcBorders>
-            <w:shd w:val="clear" w:color="auto" w:fill="auto"/>
-            <w:noWrap/>
-            <w:vAlign w:val="center"/>
-            <w:hideMark/>
-          </w:tcPr>
-          <w:p>
-            <w:pPr>
-              <w:spacing w:after="0" w:line="240" w:lineRule="auto"/>
-              <w:jc w:val="center"/>
-              <w:rPr>
-                <w:rFonts w:ascii="Arial" w:eastAsia="Times New Roman" w:hAnsi="Arial" w:cs="Arial"/>
-                <w:sz w:val="20"/>
-                <w:szCs w:val="20"/>
-              </w:rPr>
-            </w:pPr>
-          </w:p>
-        </w:tc>
-        <w:tc>
-          <w:tcPr>
-            <w:tcW w:w="802" w:type="pct"/>
-            <w:tcBorders>
-              <w:top w:val="nil"/>
-              <w:left w:val="nil"/>
-              <w:bottom w:val="nil"/>
-              <w:right w:val="single" w:sz="4" w:space="0" w:color="808080"/>
-            </w:tcBorders>
-            <w:shd w:val="clear" w:color="auto" w:fill="auto"/>
-            <w:noWrap/>
-            <w:vAlign w:val="center"/>
-          </w:tcPr>
-          <w:p>
-            <w:pPr>
-              <w:spacing w:after="0" w:line="240" w:lineRule="auto"/>
-              <w:jc w:val="right"/>
-              <w:rPr>
-                <w:rFonts w:ascii="Arial" w:eastAsia="Times New Roman" w:hAnsi="Arial" w:cs="Arial"/>
-                <w:sz w:val="20"/>
-                <w:szCs w:val="20"/>
-              </w:rPr>
-            </w:pPr>
-          </w:p>
-        </w:tc>
-      </w:tr>
-      <w:tr>
-        <w:trPr>
-          <w:trHeight w:val="285"/>
-        </w:trPr>
-        <w:tc>
-          <w:tcPr>
-            <w:tcW w:w="2687" w:type="pct"/>
-            <w:tcBorders>
-              <w:top w:val="nil"/>
-              <w:left w:val="single" w:sz="4" w:space="0" w:color="808080"/>
-              <w:bottom w:val="nil"/>
-              <w:right w:val="nil"/>
-            </w:tcBorders>
-            <w:shd w:val="clear" w:color="auto" w:fill="auto"/>
-            <w:noWrap/>
-            <w:vAlign w:val="center"/>
-            <w:hideMark/>
-          </w:tcPr>
-          <w:p>
-            <w:pPr>
-              <w:spacing w:after="0" w:line="240" w:lineRule="auto"/>
-              <w:rPr>
-                <w:rFonts w:ascii="Arial" w:eastAsia="Times New Roman" w:hAnsi="Arial" w:cs="Arial"/>
-                <w:sz w:val="20"/>
-                <w:szCs w:val="20"/>
-              </w:rPr>
-            </w:pPr>
-            <w:r>
-              <w:rPr>
-                <w:rFonts w:ascii="Arial" w:eastAsia="Times New Roman" w:hAnsi="Arial" w:cs="Arial"/>
-                <w:sz w:val="20"/>
-                <w:szCs w:val="20"/>
-              </w:rPr>
-              <w:t> </w:t>
-            </w:r>
-          </w:p>
-        </w:tc>
-        <w:tc>
-          <w:tcPr>
-            <w:tcW w:w="708" w:type="pct"/>
-            <w:tcBorders>
-              <w:top w:val="nil"/>
-              <w:left w:val="single" w:sz="4" w:space="0" w:color="808080"/>
-              <w:bottom w:val="nil"/>
-              <w:right w:val="single" w:sz="4" w:space="0" w:color="808080"/>
-            </w:tcBorders>
-            <w:shd w:val="clear" w:color="auto" w:fill="auto"/>
-            <w:noWrap/>
-            <w:vAlign w:val="center"/>
-            <w:hideMark/>
-          </w:tcPr>
-          <w:p>
-            <w:pPr>
-              <w:spacing w:after="0" w:line="240" w:lineRule="auto"/>
-              <w:jc w:val="center"/>
-              <w:rPr>
-                <w:rFonts w:ascii="Arial" w:eastAsia="Times New Roman" w:hAnsi="Arial" w:cs="Arial"/>
-                <w:sz w:val="20"/>
-                <w:szCs w:val="20"/>
-              </w:rPr>
-            </w:pPr>
-          </w:p>
-        </w:tc>
-        <w:tc>
-          <w:tcPr>
-            <w:tcW w:w="802" w:type="pct"/>
-            <w:tcBorders>
-              <w:top w:val="nil"/>
-              <w:left w:val="nil"/>
-              <w:bottom w:val="nil"/>
-              <w:right w:val="single" w:sz="4" w:space="0" w:color="808080"/>
-            </w:tcBorders>
-            <w:shd w:val="clear" w:color="auto" w:fill="auto"/>
-            <w:noWrap/>
-            <w:vAlign w:val="center"/>
-            <w:hideMark/>
-          </w:tcPr>
-          <w:p>
-            <w:pPr>
-              <w:spacing w:after="0" w:line="240" w:lineRule="auto"/>
-              <w:jc w:val="center"/>
-              <w:rPr>
-                <w:rFonts w:ascii="Arial" w:eastAsia="Times New Roman" w:hAnsi="Arial" w:cs="Arial"/>
-                <w:sz w:val="20"/>
-                <w:szCs w:val="20"/>
-              </w:rPr>
-            </w:pPr>
-          </w:p>
-        </w:tc>
-        <w:tc>
-          <w:tcPr>
-            <w:tcW w:w="802" w:type="pct"/>
-            <w:tcBorders>
-              <w:top w:val="nil"/>
-              <w:left w:val="nil"/>
-              <w:bottom w:val="nil"/>
-              <w:right w:val="single" w:sz="4" w:space="0" w:color="808080"/>
-            </w:tcBorders>
-            <w:shd w:val="clear" w:color="auto" w:fill="auto"/>
-            <w:noWrap/>
-            <w:vAlign w:val="center"/>
-          </w:tcPr>
-          <w:p>
-            <w:pPr>
-              <w:spacing w:after="0" w:line="240" w:lineRule="auto"/>
-              <w:jc w:val="right"/>
-              <w:rPr>
-                <w:rFonts w:ascii="Arial" w:eastAsia="Times New Roman" w:hAnsi="Arial" w:cs="Arial"/>
-                <w:sz w:val="20"/>
-                <w:szCs w:val="20"/>
-              </w:rPr>
-            </w:pPr>
-          </w:p>
-        </w:tc>
-      </w:tr>
-      <w:tr>
-        <w:trPr>
-          <w:trHeight w:val="285"/>
-        </w:trPr>
-        <w:tc>
-          <w:tcPr>
-            <w:tcW w:w="2687" w:type="pct"/>
-            <w:tcBorders>
-              <w:top w:val="nil"/>
-              <w:left w:val="single" w:sz="4" w:space="0" w:color="808080"/>
-              <w:bottom w:val="nil"/>
-              <w:right w:val="nil"/>
-            </w:tcBorders>
-            <w:shd w:val="clear" w:color="auto" w:fill="auto"/>
-            <w:noWrap/>
-            <w:vAlign w:val="center"/>
-            <w:hideMark/>
-          </w:tcPr>
-          <w:p>
-            <w:pPr>
-              <w:spacing w:after="0" w:line="240" w:lineRule="auto"/>
-              <w:rPr>
-                <w:rFonts w:ascii="Arial" w:eastAsia="Times New Roman" w:hAnsi="Arial" w:cs="Arial"/>
-                <w:sz w:val="20"/>
-                <w:szCs w:val="20"/>
-              </w:rPr>
-            </w:pPr>
-            <w:r>
-              <w:rPr>
-                <w:rFonts w:ascii="Arial" w:eastAsia="Times New Roman" w:hAnsi="Arial" w:cs="Arial"/>
-                <w:sz w:val="20"/>
-                <w:szCs w:val="20"/>
-              </w:rPr>
-              <w:t> </w:t>
-            </w:r>
-          </w:p>
-        </w:tc>
-        <w:tc>
-          <w:tcPr>
-            <w:tcW w:w="708" w:type="pct"/>
-            <w:tcBorders>
-              <w:top w:val="nil"/>
-              <w:left w:val="single" w:sz="4" w:space="0" w:color="808080"/>
-              <w:bottom w:val="nil"/>
-              <w:right w:val="single" w:sz="4" w:space="0" w:color="808080"/>
-            </w:tcBorders>
-            <w:shd w:val="clear" w:color="auto" w:fill="auto"/>
-            <w:noWrap/>
-            <w:vAlign w:val="center"/>
-            <w:hideMark/>
-          </w:tcPr>
-          <w:p>
-            <w:pPr>
-              <w:spacing w:after="0" w:line="240" w:lineRule="auto"/>
-              <w:jc w:val="center"/>
-              <w:rPr>
-                <w:rFonts w:ascii="Arial" w:eastAsia="Times New Roman" w:hAnsi="Arial" w:cs="Arial"/>
-                <w:sz w:val="20"/>
-                <w:szCs w:val="20"/>
-              </w:rPr>
-            </w:pPr>
-          </w:p>
-        </w:tc>
-        <w:tc>
-          <w:tcPr>
-            <w:tcW w:w="802" w:type="pct"/>
-            <w:tcBorders>
-              <w:top w:val="nil"/>
-              <w:left w:val="nil"/>
-              <w:bottom w:val="nil"/>
-              <w:right w:val="single" w:sz="4" w:space="0" w:color="808080"/>
-            </w:tcBorders>
-            <w:shd w:val="clear" w:color="auto" w:fill="auto"/>
-            <w:noWrap/>
-            <w:vAlign w:val="center"/>
-            <w:hideMark/>
-          </w:tcPr>
-          <w:p>
-            <w:pPr>
-              <w:spacing w:after="0" w:line="240" w:lineRule="auto"/>
-              <w:jc w:val="center"/>
-              <w:rPr>
-                <w:rFonts w:ascii="Arial" w:eastAsia="Times New Roman" w:hAnsi="Arial" w:cs="Arial"/>
-                <w:sz w:val="20"/>
-                <w:szCs w:val="20"/>
-              </w:rPr>
-            </w:pPr>
-          </w:p>
-        </w:tc>
-        <w:tc>
-          <w:tcPr>
-            <w:tcW w:w="802" w:type="pct"/>
-            <w:tcBorders>
-              <w:top w:val="nil"/>
-              <w:left w:val="nil"/>
-              <w:bottom w:val="nil"/>
-              <w:right w:val="single" w:sz="4" w:space="0" w:color="808080"/>
-            </w:tcBorders>
-            <w:shd w:val="clear" w:color="auto" w:fill="auto"/>
-            <w:noWrap/>
-            <w:vAlign w:val="center"/>
-          </w:tcPr>
-          <w:p>
-            <w:pPr>
-              <w:spacing w:after="0" w:line="240" w:lineRule="auto"/>
-              <w:jc w:val="right"/>
-              <w:rPr>
-                <w:rFonts w:ascii="Arial" w:eastAsia="Times New Roman" w:hAnsi="Arial" w:cs="Arial"/>
-                <w:sz w:val="20"/>
-                <w:szCs w:val="20"/>
-              </w:rPr>
-            </w:pPr>
-          </w:p>
-        </w:tc>
-      </w:tr>
-      <w:tr>
-        <w:trPr>
-          <w:trHeight w:val="285"/>
-        </w:trPr>
-        <w:tc>
-          <w:tcPr>
-            <w:tcW w:w="2687" w:type="pct"/>
-            <w:tcBorders>
-              <w:top w:val="nil"/>
-              <w:left w:val="single" w:sz="4" w:space="0" w:color="808080"/>
-              <w:bottom w:val="nil"/>
-              <w:right w:val="nil"/>
-            </w:tcBorders>
-            <w:shd w:val="clear" w:color="auto" w:fill="auto"/>
-            <w:noWrap/>
-            <w:vAlign w:val="center"/>
-            <w:hideMark/>
-          </w:tcPr>
-          <w:p>
-            <w:pPr>
-              <w:spacing w:after="0" w:line="240" w:lineRule="auto"/>
-              <w:rPr>
-                <w:rFonts w:ascii="Arial" w:eastAsia="Times New Roman" w:hAnsi="Arial" w:cs="Arial"/>
-                <w:sz w:val="20"/>
-                <w:szCs w:val="20"/>
-              </w:rPr>
-            </w:pPr>
-            <w:r>
-              <w:rPr>
-                <w:rFonts w:ascii="Arial" w:eastAsia="Times New Roman" w:hAnsi="Arial" w:cs="Arial"/>
-                <w:sz w:val="20"/>
-                <w:szCs w:val="20"/>
-              </w:rPr>
-              <w:t> </w:t>
-            </w:r>
-          </w:p>
-        </w:tc>
-        <w:tc>
-          <w:tcPr>
-            <w:tcW w:w="708" w:type="pct"/>
-            <w:tcBorders>
-              <w:top w:val="nil"/>
-              <w:left w:val="single" w:sz="4" w:space="0" w:color="808080"/>
-              <w:bottom w:val="nil"/>
-              <w:right w:val="single" w:sz="4" w:space="0" w:color="808080"/>
-            </w:tcBorders>
-            <w:shd w:val="clear" w:color="auto" w:fill="auto"/>
-            <w:noWrap/>
-            <w:vAlign w:val="center"/>
-            <w:hideMark/>
-          </w:tcPr>
-          <w:p>
-            <w:pPr>
-              <w:spacing w:after="0" w:line="240" w:lineRule="auto"/>
-              <w:jc w:val="center"/>
-              <w:rPr>
-                <w:rFonts w:ascii="Arial" w:eastAsia="Times New Roman" w:hAnsi="Arial" w:cs="Arial"/>
-                <w:sz w:val="20"/>
-                <w:szCs w:val="20"/>
-              </w:rPr>
-            </w:pPr>
-          </w:p>
-        </w:tc>
-        <w:tc>
-          <w:tcPr>
-            <w:tcW w:w="802" w:type="pct"/>
-            <w:tcBorders>
-              <w:top w:val="nil"/>
-              <w:left w:val="nil"/>
-              <w:bottom w:val="nil"/>
-              <w:right w:val="single" w:sz="4" w:space="0" w:color="808080"/>
-            </w:tcBorders>
-            <w:shd w:val="clear" w:color="auto" w:fill="auto"/>
-            <w:noWrap/>
-            <w:vAlign w:val="center"/>
-            <w:hideMark/>
-          </w:tcPr>
-          <w:p>
-            <w:pPr>
-              <w:spacing w:after="0" w:line="240" w:lineRule="auto"/>
-              <w:jc w:val="center"/>
-              <w:rPr>
-                <w:rFonts w:ascii="Arial" w:eastAsia="Times New Roman" w:hAnsi="Arial" w:cs="Arial"/>
-                <w:sz w:val="20"/>
-                <w:szCs w:val="20"/>
-              </w:rPr>
-            </w:pPr>
-          </w:p>
-        </w:tc>
-        <w:tc>
-          <w:tcPr>
-            <w:tcW w:w="802" w:type="pct"/>
-            <w:tcBorders>
-              <w:top w:val="nil"/>
-              <w:left w:val="nil"/>
-              <w:bottom w:val="nil"/>
-              <w:right w:val="single" w:sz="4" w:space="0" w:color="808080"/>
-            </w:tcBorders>
-            <w:shd w:val="clear" w:color="auto" w:fill="auto"/>
-            <w:noWrap/>
-            <w:vAlign w:val="center"/>
-          </w:tcPr>
-          <w:p>
-            <w:pPr>
-              <w:spacing w:after="0" w:line="240" w:lineRule="auto"/>
-              <w:jc w:val="right"/>
-              <w:rPr>
-                <w:rFonts w:ascii="Arial" w:eastAsia="Times New Roman" w:hAnsi="Arial" w:cs="Arial"/>
-                <w:sz w:val="20"/>
-                <w:szCs w:val="20"/>
-              </w:rPr>
-            </w:pPr>
-          </w:p>
-        </w:tc>
-      </w:tr>
-      <w:tr>
-        <w:trPr>
-          <w:trHeight w:val="285"/>
-        </w:trPr>
-        <w:tc>
-          <w:tcPr>
-            <w:tcW w:w="2687" w:type="pct"/>
-            <w:tcBorders>
-              <w:top w:val="nil"/>
-              <w:left w:val="single" w:sz="4" w:space="0" w:color="808080"/>
-              <w:bottom w:val="nil"/>
-              <w:right w:val="nil"/>
-            </w:tcBorders>
-            <w:shd w:val="clear" w:color="auto" w:fill="auto"/>
-            <w:noWrap/>
-            <w:vAlign w:val="center"/>
-            <w:hideMark/>
-          </w:tcPr>
-          <w:p>
-            <w:pPr>
-              <w:spacing w:after="0" w:line="240" w:lineRule="auto"/>
-              <w:rPr>
-                <w:rFonts w:ascii="Arial" w:eastAsia="Times New Roman" w:hAnsi="Arial" w:cs="Arial"/>
-                <w:sz w:val="20"/>
-                <w:szCs w:val="20"/>
-              </w:rPr>
-            </w:pPr>
-            <w:r>
-              <w:rPr>
-                <w:rFonts w:ascii="Arial" w:eastAsia="Times New Roman" w:hAnsi="Arial" w:cs="Arial"/>
-                <w:sz w:val="20"/>
-                <w:szCs w:val="20"/>
-              </w:rPr>
-              <w:t> </w:t>
-            </w:r>
-          </w:p>
-        </w:tc>
-        <w:tc>
-          <w:tcPr>
-            <w:tcW w:w="708" w:type="pct"/>
-            <w:tcBorders>
-              <w:top w:val="nil"/>
-              <w:left w:val="single" w:sz="4" w:space="0" w:color="808080"/>
-              <w:bottom w:val="nil"/>
-              <w:right w:val="single" w:sz="4" w:space="0" w:color="808080"/>
-            </w:tcBorders>
-            <w:shd w:val="clear" w:color="auto" w:fill="auto"/>
-            <w:noWrap/>
-            <w:vAlign w:val="center"/>
-            <w:hideMark/>
-          </w:tcPr>
-          <w:p>
-            <w:pPr>
-              <w:spacing w:after="0" w:line="240" w:lineRule="auto"/>
-              <w:jc w:val="center"/>
-              <w:rPr>
-                <w:rFonts w:ascii="Arial" w:eastAsia="Times New Roman" w:hAnsi="Arial" w:cs="Arial"/>
-                <w:sz w:val="20"/>
-                <w:szCs w:val="20"/>
-              </w:rPr>
-            </w:pPr>
-          </w:p>
-        </w:tc>
-        <w:tc>
-          <w:tcPr>
-            <w:tcW w:w="802" w:type="pct"/>
-            <w:tcBorders>
-              <w:top w:val="nil"/>
-              <w:left w:val="nil"/>
-              <w:bottom w:val="nil"/>
-              <w:right w:val="single" w:sz="4" w:space="0" w:color="808080"/>
-            </w:tcBorders>
-            <w:shd w:val="clear" w:color="auto" w:fill="auto"/>
-            <w:noWrap/>
-            <w:vAlign w:val="center"/>
-            <w:hideMark/>
-          </w:tcPr>
-          <w:p>
-            <w:pPr>
-              <w:spacing w:after="0" w:line="240" w:lineRule="auto"/>
-              <w:jc w:val="center"/>
-              <w:rPr>
-                <w:rFonts w:ascii="Arial" w:eastAsia="Times New Roman" w:hAnsi="Arial" w:cs="Arial"/>
-                <w:sz w:val="20"/>
-                <w:szCs w:val="20"/>
-              </w:rPr>
-            </w:pPr>
-          </w:p>
-        </w:tc>
-        <w:tc>
-          <w:tcPr>
-            <w:tcW w:w="802" w:type="pct"/>
-            <w:tcBorders>
-              <w:top w:val="nil"/>
-              <w:left w:val="nil"/>
-              <w:bottom w:val="nil"/>
-              <w:right w:val="single" w:sz="4" w:space="0" w:color="808080"/>
-            </w:tcBorders>
-            <w:shd w:val="clear" w:color="auto" w:fill="auto"/>
-            <w:noWrap/>
-            <w:vAlign w:val="center"/>
-          </w:tcPr>
-          <w:p>
-            <w:pPr>
-              <w:spacing w:after="0" w:line="240" w:lineRule="auto"/>
-              <w:jc w:val="right"/>
-              <w:rPr>
-                <w:rFonts w:ascii="Arial" w:eastAsia="Times New Roman" w:hAnsi="Arial" w:cs="Arial"/>
-                <w:sz w:val="20"/>
-                <w:szCs w:val="20"/>
-              </w:rPr>
-            </w:pPr>
-          </w:p>
-        </w:tc>
-      </w:tr>
-      <w:tr>
-        <w:trPr>
-          <w:trHeight w:val="285"/>
-        </w:trPr>
-        <w:tc>
-          <w:tcPr>
-            <w:tcW w:w="2687" w:type="pct"/>
-            <w:tcBorders>
-              <w:top w:val="nil"/>
-              <w:left w:val="single" w:sz="4" w:space="0" w:color="808080"/>
-              <w:bottom w:val="nil"/>
-              <w:right w:val="nil"/>
-            </w:tcBorders>
-            <w:shd w:val="clear" w:color="auto" w:fill="auto"/>
-            <w:noWrap/>
-            <w:vAlign w:val="center"/>
-            <w:hideMark/>
-          </w:tcPr>
-          <w:p>
-            <w:pPr>
-              <w:spacing w:after="0" w:line="240" w:lineRule="auto"/>
-              <w:rPr>
-                <w:rFonts w:ascii="Arial" w:eastAsia="Times New Roman" w:hAnsi="Arial" w:cs="Arial"/>
-                <w:sz w:val="20"/>
-                <w:szCs w:val="20"/>
-              </w:rPr>
-            </w:pPr>
-            <w:r>
-              <w:rPr>
-                <w:rFonts w:ascii="Arial" w:eastAsia="Times New Roman" w:hAnsi="Arial" w:cs="Arial"/>
-                <w:sz w:val="20"/>
-                <w:szCs w:val="20"/>
-              </w:rPr>
-              <w:t> </w:t>
-            </w:r>
-          </w:p>
-        </w:tc>
-        <w:tc>
-          <w:tcPr>
-            <w:tcW w:w="708" w:type="pct"/>
-            <w:tcBorders>
-              <w:top w:val="nil"/>
-              <w:left w:val="single" w:sz="4" w:space="0" w:color="808080"/>
-              <w:bottom w:val="nil"/>
-              <w:right w:val="single" w:sz="4" w:space="0" w:color="808080"/>
-            </w:tcBorders>
-            <w:shd w:val="clear" w:color="auto" w:fill="auto"/>
-            <w:noWrap/>
-            <w:vAlign w:val="center"/>
-            <w:hideMark/>
-          </w:tcPr>
-          <w:p>
-            <w:pPr>
-              <w:spacing w:after="0" w:line="240" w:lineRule="auto"/>
-              <w:jc w:val="center"/>
-              <w:rPr>
-                <w:rFonts w:ascii="Arial" w:eastAsia="Times New Roman" w:hAnsi="Arial" w:cs="Arial"/>
-                <w:sz w:val="20"/>
-                <w:szCs w:val="20"/>
-              </w:rPr>
-            </w:pPr>
-          </w:p>
-        </w:tc>
-        <w:tc>
-          <w:tcPr>
-            <w:tcW w:w="802" w:type="pct"/>
-            <w:tcBorders>
-              <w:top w:val="nil"/>
-              <w:left w:val="nil"/>
-              <w:bottom w:val="nil"/>
-              <w:right w:val="single" w:sz="4" w:space="0" w:color="808080"/>
-            </w:tcBorders>
-            <w:shd w:val="clear" w:color="auto" w:fill="auto"/>
-            <w:noWrap/>
-            <w:vAlign w:val="center"/>
-            <w:hideMark/>
-          </w:tcPr>
-          <w:p>
-            <w:pPr>
-              <w:spacing w:after="0" w:line="240" w:lineRule="auto"/>
-              <w:jc w:val="center"/>
-              <w:rPr>
-                <w:rFonts w:ascii="Arial" w:eastAsia="Times New Roman" w:hAnsi="Arial" w:cs="Arial"/>
-                <w:sz w:val="20"/>
-                <w:szCs w:val="20"/>
-              </w:rPr>
-            </w:pPr>
-          </w:p>
-        </w:tc>
-        <w:tc>
-          <w:tcPr>
-            <w:tcW w:w="802" w:type="pct"/>
-            <w:tcBorders>
-              <w:top w:val="nil"/>
-              <w:left w:val="nil"/>
-              <w:bottom w:val="nil"/>
-              <w:right w:val="single" w:sz="4" w:space="0" w:color="808080"/>
-            </w:tcBorders>
-            <w:shd w:val="clear" w:color="auto" w:fill="auto"/>
-            <w:noWrap/>
-            <w:vAlign w:val="center"/>
-          </w:tcPr>
-          <w:p>
-            <w:pPr>
-              <w:spacing w:after="0" w:line="240" w:lineRule="auto"/>
-              <w:jc w:val="right"/>
-              <w:rPr>
-                <w:rFonts w:ascii="Arial" w:eastAsia="Times New Roman" w:hAnsi="Arial" w:cs="Arial"/>
-                <w:sz w:val="20"/>
-                <w:szCs w:val="20"/>
-              </w:rPr>
-            </w:pPr>
-          </w:p>
-        </w:tc>
-      </w:tr>
-      <w:tr>
-        <w:trPr>
-          <w:trHeight w:val="285"/>
-        </w:trPr>
-        <w:tc>
-          <w:tcPr>
-            <w:tcW w:w="2687" w:type="pct"/>
-            <w:tcBorders>
-              <w:top w:val="nil"/>
-              <w:left w:val="single" w:sz="4" w:space="0" w:color="808080"/>
-              <w:bottom w:val="nil"/>
-              <w:right w:val="nil"/>
-            </w:tcBorders>
-            <w:shd w:val="clear" w:color="auto" w:fill="auto"/>
-            <w:noWrap/>
-            <w:vAlign w:val="center"/>
-            <w:hideMark/>
-          </w:tcPr>
-          <w:p>
-            <w:pPr>
-              <w:spacing w:after="0" w:line="240" w:lineRule="auto"/>
-              <w:rPr>
-                <w:rFonts w:ascii="Arial" w:eastAsia="Times New Roman" w:hAnsi="Arial" w:cs="Arial"/>
-                <w:sz w:val="20"/>
-                <w:szCs w:val="20"/>
-              </w:rPr>
-            </w:pPr>
-            <w:r>
-              <w:rPr>
-                <w:rFonts w:ascii="Arial" w:eastAsia="Times New Roman" w:hAnsi="Arial" w:cs="Arial"/>
-                <w:sz w:val="20"/>
-                <w:szCs w:val="20"/>
-              </w:rPr>
-              <w:t> </w:t>
-            </w:r>
-          </w:p>
-        </w:tc>
-        <w:tc>
-          <w:tcPr>
-            <w:tcW w:w="708" w:type="pct"/>
-            <w:tcBorders>
-              <w:top w:val="nil"/>
-              <w:left w:val="single" w:sz="4" w:space="0" w:color="808080"/>
-              <w:bottom w:val="nil"/>
-              <w:right w:val="single" w:sz="4" w:space="0" w:color="808080"/>
-            </w:tcBorders>
-            <w:shd w:val="clear" w:color="auto" w:fill="auto"/>
-            <w:noWrap/>
-            <w:vAlign w:val="center"/>
-            <w:hideMark/>
-          </w:tcPr>
-          <w:p>
-            <w:pPr>
-              <w:spacing w:after="0" w:line="240" w:lineRule="auto"/>
-              <w:jc w:val="center"/>
-              <w:rPr>
-                <w:rFonts w:ascii="Arial" w:eastAsia="Times New Roman" w:hAnsi="Arial" w:cs="Arial"/>
-                <w:sz w:val="20"/>
-                <w:szCs w:val="20"/>
-              </w:rPr>
-            </w:pPr>
-          </w:p>
-        </w:tc>
-        <w:tc>
-          <w:tcPr>
-            <w:tcW w:w="802" w:type="pct"/>
-            <w:tcBorders>
-              <w:top w:val="nil"/>
-              <w:left w:val="nil"/>
-              <w:bottom w:val="nil"/>
-              <w:right w:val="single" w:sz="4" w:space="0" w:color="808080"/>
-            </w:tcBorders>
-            <w:shd w:val="clear" w:color="auto" w:fill="auto"/>
-            <w:noWrap/>
-            <w:vAlign w:val="center"/>
-            <w:hideMark/>
-          </w:tcPr>
-          <w:p>
-            <w:pPr>
-              <w:spacing w:after="0" w:line="240" w:lineRule="auto"/>
-              <w:jc w:val="center"/>
-              <w:rPr>
-                <w:rFonts w:ascii="Arial" w:eastAsia="Times New Roman" w:hAnsi="Arial" w:cs="Arial"/>
-                <w:sz w:val="20"/>
-                <w:szCs w:val="20"/>
-              </w:rPr>
-            </w:pPr>
-          </w:p>
-        </w:tc>
-        <w:tc>
-          <w:tcPr>
-            <w:tcW w:w="802" w:type="pct"/>
-            <w:tcBorders>
-              <w:top w:val="nil"/>
-              <w:left w:val="nil"/>
-              <w:bottom w:val="nil"/>
-              <w:right w:val="single" w:sz="4" w:space="0" w:color="808080"/>
-            </w:tcBorders>
-            <w:shd w:val="clear" w:color="auto" w:fill="auto"/>
-            <w:noWrap/>
-            <w:vAlign w:val="center"/>
-          </w:tcPr>
-          <w:p>
-            <w:pPr>
-              <w:spacing w:after="0" w:line="240" w:lineRule="auto"/>
-              <w:jc w:val="right"/>
-              <w:rPr>
-                <w:rFonts w:ascii="Arial" w:eastAsia="Times New Roman" w:hAnsi="Arial" w:cs="Arial"/>
-                <w:sz w:val="20"/>
-                <w:szCs w:val="20"/>
-              </w:rPr>
-            </w:pPr>
-          </w:p>
-        </w:tc>
-      </w:tr>
-      <w:tr>
-        <w:trPr>
-          <w:trHeight w:val="285"/>
-        </w:trPr>
-        <w:tc>
-          <w:tcPr>
-            <w:tcW w:w="2687" w:type="pct"/>
-            <w:tcBorders>
-              <w:top w:val="nil"/>
-              <w:left w:val="single" w:sz="4" w:space="0" w:color="808080"/>
-              <w:bottom w:val="nil"/>
-              <w:right w:val="nil"/>
-            </w:tcBorders>
-            <w:shd w:val="clear" w:color="auto" w:fill="auto"/>
-            <w:noWrap/>
-            <w:vAlign w:val="center"/>
-            <w:hideMark/>
-          </w:tcPr>
-          <w:p>
-            <w:pPr>
-              <w:spacing w:after="0" w:line="240" w:lineRule="auto"/>
-              <w:rPr>
-                <w:rFonts w:ascii="Arial" w:eastAsia="Times New Roman" w:hAnsi="Arial" w:cs="Arial"/>
-                <w:sz w:val="20"/>
-                <w:szCs w:val="20"/>
-              </w:rPr>
-            </w:pPr>
-            <w:r>
-              <w:rPr>
-                <w:rFonts w:ascii="Arial" w:eastAsia="Times New Roman" w:hAnsi="Arial" w:cs="Arial"/>
-                <w:sz w:val="20"/>
-                <w:szCs w:val="20"/>
-              </w:rPr>
-              <w:t> </w:t>
-            </w:r>
-          </w:p>
-        </w:tc>
-        <w:tc>
-          <w:tcPr>
-            <w:tcW w:w="708" w:type="pct"/>
-            <w:tcBorders>
-              <w:top w:val="nil"/>
-              <w:left w:val="single" w:sz="4" w:space="0" w:color="808080"/>
-              <w:bottom w:val="nil"/>
-              <w:right w:val="single" w:sz="4" w:space="0" w:color="808080"/>
-            </w:tcBorders>
-            <w:shd w:val="clear" w:color="auto" w:fill="auto"/>
-            <w:noWrap/>
-            <w:vAlign w:val="center"/>
-            <w:hideMark/>
-          </w:tcPr>
-          <w:p>
-            <w:pPr>
-              <w:spacing w:after="0" w:line="240" w:lineRule="auto"/>
-              <w:jc w:val="center"/>
-              <w:rPr>
-                <w:rFonts w:ascii="Arial" w:eastAsia="Times New Roman" w:hAnsi="Arial" w:cs="Arial"/>
-                <w:sz w:val="20"/>
-                <w:szCs w:val="20"/>
-              </w:rPr>
-            </w:pPr>
-          </w:p>
-        </w:tc>
-        <w:tc>
-          <w:tcPr>
-            <w:tcW w:w="802" w:type="pct"/>
-            <w:tcBorders>
-              <w:top w:val="nil"/>
-              <w:left w:val="nil"/>
-              <w:bottom w:val="nil"/>
-              <w:right w:val="single" w:sz="4" w:space="0" w:color="808080"/>
-            </w:tcBorders>
-            <w:shd w:val="clear" w:color="auto" w:fill="auto"/>
-            <w:noWrap/>
-            <w:vAlign w:val="center"/>
-            <w:hideMark/>
-          </w:tcPr>
-          <w:p>
-            <w:pPr>
-              <w:spacing w:after="0" w:line="240" w:lineRule="auto"/>
-              <w:jc w:val="center"/>
-              <w:rPr>
-                <w:rFonts w:ascii="Arial" w:eastAsia="Times New Roman" w:hAnsi="Arial" w:cs="Arial"/>
-                <w:sz w:val="20"/>
-                <w:szCs w:val="20"/>
-              </w:rPr>
-            </w:pPr>
-          </w:p>
-        </w:tc>
-        <w:tc>
-          <w:tcPr>
-            <w:tcW w:w="802" w:type="pct"/>
-            <w:tcBorders>
-              <w:top w:val="nil"/>
-              <w:left w:val="nil"/>
-              <w:bottom w:val="nil"/>
-              <w:right w:val="single" w:sz="4" w:space="0" w:color="808080"/>
-            </w:tcBorders>
-            <w:shd w:val="clear" w:color="auto" w:fill="auto"/>
-            <w:noWrap/>
-            <w:vAlign w:val="center"/>
-          </w:tcPr>
-          <w:p>
-            <w:pPr>
-              <w:spacing w:after="0" w:line="240" w:lineRule="auto"/>
-              <w:jc w:val="right"/>
-              <w:rPr>
-                <w:rFonts w:ascii="Arial" w:eastAsia="Times New Roman" w:hAnsi="Arial" w:cs="Arial"/>
-                <w:sz w:val="20"/>
-                <w:szCs w:val="20"/>
-              </w:rPr>
-            </w:pPr>
-          </w:p>
-        </w:tc>
-      </w:tr>
-      <w:tr>
-        <w:trPr>
-          <w:trHeight w:val="285"/>
-        </w:trPr>
-        <w:tc>
-          <w:tcPr>
-            <w:tcW w:w="2687" w:type="pct"/>
-            <w:tcBorders>
-              <w:top w:val="nil"/>
-              <w:left w:val="single" w:sz="4" w:space="0" w:color="808080"/>
-              <w:bottom w:val="nil"/>
-              <w:right w:val="nil"/>
-            </w:tcBorders>
-            <w:shd w:val="clear" w:color="auto" w:fill="auto"/>
-            <w:noWrap/>
-            <w:vAlign w:val="center"/>
-            <w:hideMark/>
-          </w:tcPr>
-          <w:p>
-            <w:pPr>
-              <w:spacing w:after="0" w:line="240" w:lineRule="auto"/>
-              <w:rPr>
-                <w:rFonts w:ascii="Arial" w:eastAsia="Times New Roman" w:hAnsi="Arial" w:cs="Arial"/>
-                <w:sz w:val="20"/>
-                <w:szCs w:val="20"/>
-              </w:rPr>
-            </w:pPr>
-            <w:r>
-              <w:rPr>
-                <w:rFonts w:ascii="Arial" w:eastAsia="Times New Roman" w:hAnsi="Arial" w:cs="Arial"/>
-                <w:sz w:val="20"/>
-                <w:szCs w:val="20"/>
-              </w:rPr>
-              <w:t> </w:t>
-            </w:r>
-          </w:p>
-        </w:tc>
-        <w:tc>
-          <w:tcPr>
-            <w:tcW w:w="708" w:type="pct"/>
-            <w:tcBorders>
-              <w:top w:val="nil"/>
-              <w:left w:val="single" w:sz="4" w:space="0" w:color="808080"/>
-              <w:bottom w:val="nil"/>
-              <w:right w:val="single" w:sz="4" w:space="0" w:color="808080"/>
-            </w:tcBorders>
-            <w:shd w:val="clear" w:color="auto" w:fill="auto"/>
-            <w:noWrap/>
-            <w:vAlign w:val="center"/>
-            <w:hideMark/>
-          </w:tcPr>
-          <w:p>
-            <w:pPr>
-              <w:spacing w:after="0" w:line="240" w:lineRule="auto"/>
-              <w:jc w:val="center"/>
-              <w:rPr>
-                <w:rFonts w:ascii="Arial" w:eastAsia="Times New Roman" w:hAnsi="Arial" w:cs="Arial"/>
-                <w:sz w:val="20"/>
-                <w:szCs w:val="20"/>
-              </w:rPr>
-            </w:pPr>
-          </w:p>
-        </w:tc>
-        <w:tc>
-          <w:tcPr>
-            <w:tcW w:w="802" w:type="pct"/>
-            <w:tcBorders>
-              <w:top w:val="nil"/>
-              <w:left w:val="nil"/>
-              <w:bottom w:val="nil"/>
-              <w:right w:val="single" w:sz="4" w:space="0" w:color="808080"/>
-            </w:tcBorders>
-            <w:shd w:val="clear" w:color="auto" w:fill="auto"/>
-            <w:noWrap/>
-            <w:vAlign w:val="center"/>
-            <w:hideMark/>
-          </w:tcPr>
-          <w:p>
-            <w:pPr>
-              <w:spacing w:after="0" w:line="240" w:lineRule="auto"/>
-              <w:jc w:val="center"/>
-              <w:rPr>
-                <w:rFonts w:ascii="Arial" w:eastAsia="Times New Roman" w:hAnsi="Arial" w:cs="Arial"/>
-                <w:sz w:val="20"/>
-                <w:szCs w:val="20"/>
-              </w:rPr>
-            </w:pPr>
-          </w:p>
-        </w:tc>
-        <w:tc>
-          <w:tcPr>
-            <w:tcW w:w="802" w:type="pct"/>
-            <w:tcBorders>
-              <w:top w:val="nil"/>
-              <w:left w:val="nil"/>
-              <w:bottom w:val="nil"/>
-              <w:right w:val="single" w:sz="4" w:space="0" w:color="808080"/>
-            </w:tcBorders>
-            <w:shd w:val="clear" w:color="auto" w:fill="auto"/>
-            <w:noWrap/>
-            <w:vAlign w:val="center"/>
-          </w:tcPr>
-          <w:p>
-            <w:pPr>
-              <w:spacing w:after="0" w:line="240" w:lineRule="auto"/>
-              <w:jc w:val="right"/>
-              <w:rPr>
-                <w:rFonts w:ascii="Arial" w:eastAsia="Times New Roman" w:hAnsi="Arial" w:cs="Arial"/>
-                <w:sz w:val="20"/>
-                <w:szCs w:val="20"/>
-              </w:rPr>
-            </w:pPr>
-          </w:p>
-        </w:tc>
-      </w:tr>
-      <w:tr>
-        <w:trPr>
-          <w:trHeight w:val="285"/>
-        </w:trPr>
-        <w:tc>
-          <w:tcPr>
-            <w:tcW w:w="2687" w:type="pct"/>
-            <w:tcBorders>
-              <w:top w:val="nil"/>
-              <w:left w:val="single" w:sz="4" w:space="0" w:color="808080"/>
-              <w:bottom w:val="nil"/>
-              <w:right w:val="nil"/>
-            </w:tcBorders>
-            <w:shd w:val="clear" w:color="auto" w:fill="auto"/>
-            <w:noWrap/>
-            <w:vAlign w:val="center"/>
-            <w:hideMark/>
-          </w:tcPr>
-          <w:p>
-            <w:pPr>
-              <w:spacing w:after="0" w:line="240" w:lineRule="auto"/>
-              <w:rPr>
-                <w:rFonts w:ascii="Arial" w:eastAsia="Times New Roman" w:hAnsi="Arial" w:cs="Arial"/>
-                <w:sz w:val="20"/>
-                <w:szCs w:val="20"/>
-              </w:rPr>
-            </w:pPr>
-            <w:r>
-              <w:rPr>
-                <w:rFonts w:ascii="Arial" w:eastAsia="Times New Roman" w:hAnsi="Arial" w:cs="Arial"/>
-                <w:sz w:val="20"/>
-                <w:szCs w:val="20"/>
-              </w:rPr>
-              <w:t> </w:t>
-            </w:r>
-          </w:p>
-        </w:tc>
-        <w:tc>
-          <w:tcPr>
-            <w:tcW w:w="708" w:type="pct"/>
-            <w:tcBorders>
-              <w:top w:val="nil"/>
-              <w:left w:val="single" w:sz="4" w:space="0" w:color="808080"/>
-              <w:bottom w:val="nil"/>
-              <w:right w:val="single" w:sz="4" w:space="0" w:color="808080"/>
-            </w:tcBorders>
-            <w:shd w:val="clear" w:color="auto" w:fill="auto"/>
-            <w:noWrap/>
-            <w:vAlign w:val="center"/>
-            <w:hideMark/>
-          </w:tcPr>
-          <w:p>
-            <w:pPr>
-              <w:spacing w:after="0" w:line="240" w:lineRule="auto"/>
-              <w:jc w:val="center"/>
-              <w:rPr>
-                <w:rFonts w:ascii="Arial" w:eastAsia="Times New Roman" w:hAnsi="Arial" w:cs="Arial"/>
-                <w:sz w:val="20"/>
-                <w:szCs w:val="20"/>
-              </w:rPr>
-            </w:pPr>
-          </w:p>
-        </w:tc>
-        <w:tc>
-          <w:tcPr>
-            <w:tcW w:w="802" w:type="pct"/>
-            <w:tcBorders>
-              <w:top w:val="nil"/>
-              <w:left w:val="nil"/>
-              <w:bottom w:val="nil"/>
-              <w:right w:val="single" w:sz="4" w:space="0" w:color="808080"/>
-            </w:tcBorders>
-            <w:shd w:val="clear" w:color="auto" w:fill="auto"/>
-            <w:noWrap/>
-            <w:vAlign w:val="center"/>
-            <w:hideMark/>
-          </w:tcPr>
-          <w:p>
-            <w:pPr>
-              <w:spacing w:after="0" w:line="240" w:lineRule="auto"/>
-              <w:jc w:val="center"/>
-              <w:rPr>
-                <w:rFonts w:ascii="Arial" w:eastAsia="Times New Roman" w:hAnsi="Arial" w:cs="Arial"/>
-                <w:sz w:val="20"/>
-                <w:szCs w:val="20"/>
-              </w:rPr>
-            </w:pPr>
-          </w:p>
-        </w:tc>
-        <w:tc>
-          <w:tcPr>
-            <w:tcW w:w="802" w:type="pct"/>
-            <w:tcBorders>
-              <w:top w:val="nil"/>
-              <w:left w:val="nil"/>
-              <w:bottom w:val="nil"/>
-              <w:right w:val="single" w:sz="4" w:space="0" w:color="808080"/>
-            </w:tcBorders>
-            <w:shd w:val="clear" w:color="auto" w:fill="auto"/>
-            <w:noWrap/>
-            <w:vAlign w:val="center"/>
-          </w:tcPr>
-          <w:p>
-            <w:pPr>
-              <w:spacing w:after="0" w:line="240" w:lineRule="auto"/>
-              <w:jc w:val="right"/>
-              <w:rPr>
-                <w:rFonts w:ascii="Arial" w:eastAsia="Times New Roman" w:hAnsi="Arial" w:cs="Arial"/>
-                <w:sz w:val="20"/>
-                <w:szCs w:val="20"/>
-              </w:rPr>
-            </w:pPr>
-          </w:p>
-        </w:tc>
-      </w:tr>
-      <w:tr>
-        <w:trPr>
-          <w:trHeight w:val="285"/>
-        </w:trPr>
-        <w:tc>
-          <w:tcPr>
-            <w:tcW w:w="2687" w:type="pct"/>
-            <w:tcBorders>
-              <w:top w:val="nil"/>
-              <w:left w:val="single" w:sz="4" w:space="0" w:color="808080"/>
-              <w:bottom w:val="nil"/>
-              <w:right w:val="nil"/>
-            </w:tcBorders>
-            <w:shd w:val="clear" w:color="auto" w:fill="auto"/>
-            <w:noWrap/>
-            <w:vAlign w:val="center"/>
-            <w:hideMark/>
-          </w:tcPr>
-          <w:p>
-            <w:pPr>
-              <w:spacing w:after="0" w:line="240" w:lineRule="auto"/>
-              <w:rPr>
-                <w:rFonts w:ascii="Arial" w:eastAsia="Times New Roman" w:hAnsi="Arial" w:cs="Arial"/>
-                <w:sz w:val="20"/>
-                <w:szCs w:val="20"/>
-              </w:rPr>
-            </w:pPr>
-            <w:r>
-              <w:rPr>
-                <w:rFonts w:ascii="Arial" w:eastAsia="Times New Roman" w:hAnsi="Arial" w:cs="Arial"/>
-                <w:sz w:val="20"/>
-                <w:szCs w:val="20"/>
-              </w:rPr>
-              <w:t> </w:t>
-            </w:r>
-          </w:p>
-        </w:tc>
-        <w:tc>
-          <w:tcPr>
-            <w:tcW w:w="708" w:type="pct"/>
-            <w:tcBorders>
-              <w:top w:val="nil"/>
-              <w:left w:val="single" w:sz="4" w:space="0" w:color="808080"/>
-              <w:bottom w:val="nil"/>
-              <w:right w:val="single" w:sz="4" w:space="0" w:color="808080"/>
-            </w:tcBorders>
-            <w:shd w:val="clear" w:color="auto" w:fill="auto"/>
-            <w:noWrap/>
-            <w:vAlign w:val="center"/>
-            <w:hideMark/>
-          </w:tcPr>
-          <w:p>
-            <w:pPr>
-              <w:spacing w:after="0" w:line="240" w:lineRule="auto"/>
-              <w:jc w:val="center"/>
-              <w:rPr>
-                <w:rFonts w:ascii="Arial" w:eastAsia="Times New Roman" w:hAnsi="Arial" w:cs="Arial"/>
-                <w:sz w:val="20"/>
-                <w:szCs w:val="20"/>
-              </w:rPr>
-            </w:pPr>
-          </w:p>
-        </w:tc>
-        <w:tc>
-          <w:tcPr>
-            <w:tcW w:w="802" w:type="pct"/>
-            <w:tcBorders>
-              <w:top w:val="nil"/>
-              <w:left w:val="nil"/>
-              <w:bottom w:val="nil"/>
-              <w:right w:val="single" w:sz="4" w:space="0" w:color="808080"/>
-            </w:tcBorders>
-            <w:shd w:val="clear" w:color="auto" w:fill="auto"/>
-            <w:noWrap/>
-            <w:vAlign w:val="center"/>
-            <w:hideMark/>
-          </w:tcPr>
-          <w:p>
-            <w:pPr>
-              <w:spacing w:after="0" w:line="240" w:lineRule="auto"/>
-              <w:jc w:val="center"/>
-              <w:rPr>
-                <w:rFonts w:ascii="Arial" w:eastAsia="Times New Roman" w:hAnsi="Arial" w:cs="Arial"/>
-                <w:sz w:val="20"/>
-                <w:szCs w:val="20"/>
-              </w:rPr>
-            </w:pPr>
-          </w:p>
-        </w:tc>
-        <w:tc>
-          <w:tcPr>
-            <w:tcW w:w="802" w:type="pct"/>
-            <w:tcBorders>
-              <w:top w:val="nil"/>
-              <w:left w:val="nil"/>
-              <w:bottom w:val="nil"/>
-              <w:right w:val="single" w:sz="4" w:space="0" w:color="808080"/>
-            </w:tcBorders>
-            <w:shd w:val="clear" w:color="auto" w:fill="auto"/>
-            <w:noWrap/>
-            <w:vAlign w:val="center"/>
-          </w:tcPr>
-          <w:p>
-            <w:pPr>
-              <w:spacing w:after="0" w:line="240" w:lineRule="auto"/>
-              <w:jc w:val="right"/>
-              <w:rPr>
-                <w:rFonts w:ascii="Arial" w:eastAsia="Times New Roman" w:hAnsi="Arial" w:cs="Arial"/>
-                <w:sz w:val="20"/>
-                <w:szCs w:val="20"/>
-              </w:rPr>
-            </w:pPr>
-          </w:p>
-        </w:tc>
-      </w:tr>
-      <w:tr>
-        <w:trPr>
-          <w:trHeight w:val="285"/>
-        </w:trPr>
-        <w:tc>
-          <w:tcPr>
-            <w:tcW w:w="2687" w:type="pct"/>
-            <w:tcBorders>
-              <w:top w:val="nil"/>
-              <w:left w:val="single" w:sz="4" w:space="0" w:color="808080"/>
-              <w:bottom w:val="nil"/>
-              <w:right w:val="nil"/>
-            </w:tcBorders>
-            <w:shd w:val="clear" w:color="auto" w:fill="auto"/>
-            <w:noWrap/>
-            <w:vAlign w:val="center"/>
-            <w:hideMark/>
-          </w:tcPr>
-          <w:p>
-            <w:pPr>
-              <w:spacing w:after="0" w:line="240" w:lineRule="auto"/>
-              <w:rPr>
-                <w:rFonts w:ascii="Arial" w:eastAsia="Times New Roman" w:hAnsi="Arial" w:cs="Arial"/>
-                <w:sz w:val="20"/>
-                <w:szCs w:val="20"/>
-              </w:rPr>
-            </w:pPr>
-            <w:r>
-              <w:rPr>
-                <w:rFonts w:ascii="Arial" w:eastAsia="Times New Roman" w:hAnsi="Arial" w:cs="Arial"/>
-                <w:sz w:val="20"/>
-                <w:szCs w:val="20"/>
-              </w:rPr>
-              <w:t> </w:t>
-            </w:r>
-          </w:p>
-        </w:tc>
-        <w:tc>
-          <w:tcPr>
-            <w:tcW w:w="708" w:type="pct"/>
-            <w:tcBorders>
-              <w:top w:val="nil"/>
-              <w:left w:val="single" w:sz="4" w:space="0" w:color="808080"/>
-              <w:bottom w:val="nil"/>
-              <w:right w:val="single" w:sz="4" w:space="0" w:color="808080"/>
-            </w:tcBorders>
-            <w:shd w:val="clear" w:color="auto" w:fill="auto"/>
-            <w:noWrap/>
-            <w:vAlign w:val="center"/>
-            <w:hideMark/>
-          </w:tcPr>
-          <w:p>
-            <w:pPr>
-              <w:spacing w:after="0" w:line="240" w:lineRule="auto"/>
-              <w:jc w:val="center"/>
-              <w:rPr>
-                <w:rFonts w:ascii="Arial" w:eastAsia="Times New Roman" w:hAnsi="Arial" w:cs="Arial"/>
-                <w:sz w:val="20"/>
-                <w:szCs w:val="20"/>
-              </w:rPr>
-            </w:pPr>
-          </w:p>
-        </w:tc>
-        <w:tc>
-          <w:tcPr>
-            <w:tcW w:w="802" w:type="pct"/>
-            <w:tcBorders>
-              <w:top w:val="nil"/>
-              <w:left w:val="nil"/>
-              <w:bottom w:val="nil"/>
-              <w:right w:val="single" w:sz="4" w:space="0" w:color="808080"/>
-            </w:tcBorders>
-            <w:shd w:val="clear" w:color="auto" w:fill="auto"/>
-            <w:noWrap/>
-            <w:vAlign w:val="center"/>
-            <w:hideMark/>
-          </w:tcPr>
-          <w:p>
-            <w:pPr>
-              <w:spacing w:after="0" w:line="240" w:lineRule="auto"/>
-              <w:jc w:val="center"/>
-              <w:rPr>
-                <w:rFonts w:ascii="Arial" w:eastAsia="Times New Roman" w:hAnsi="Arial" w:cs="Arial"/>
-                <w:sz w:val="20"/>
-                <w:szCs w:val="20"/>
-              </w:rPr>
-            </w:pPr>
-          </w:p>
-        </w:tc>
-        <w:tc>
-          <w:tcPr>
-            <w:tcW w:w="802" w:type="pct"/>
-            <w:tcBorders>
-              <w:top w:val="nil"/>
-              <w:left w:val="nil"/>
-              <w:bottom w:val="nil"/>
-              <w:right w:val="single" w:sz="4" w:space="0" w:color="808080"/>
-            </w:tcBorders>
-            <w:shd w:val="clear" w:color="auto" w:fill="auto"/>
-            <w:noWrap/>
-            <w:vAlign w:val="center"/>
-          </w:tcPr>
-          <w:p>
-            <w:pPr>
-              <w:spacing w:after="0" w:line="240" w:lineRule="auto"/>
-              <w:jc w:val="right"/>
-              <w:rPr>
-                <w:rFonts w:ascii="Arial" w:eastAsia="Times New Roman" w:hAnsi="Arial" w:cs="Arial"/>
-                <w:sz w:val="20"/>
-                <w:szCs w:val="20"/>
-              </w:rPr>
-            </w:pPr>
+              <w:t>{{lineTotal}}</w:t>
+            </w:r>
           </w:p>
         </w:tc>
       </w:tr>
@@ -3866,7 +1998,7 @@
                 <w:i/>
                 <w:iCs/>
               </w:rPr>
-              <w:t>Thank you for your business!</w:t>
+              <w:t>{{invoiceSubtotal}} (subtotal)  Tax ({{invoiceTaxRate}}): {{invoiceTaxAmount}}</w:t>
             </w:r>
           </w:p>
         </w:tc>
@@ -3906,7 +2038,6 @@
                 <w:sz w:val="24"/>
                 <w:szCs w:val="24"/>
               </w:rPr>
-              <w:t>TOTAL</w:t>
             </w:r>
           </w:p>
         </w:tc>
@@ -3944,7 +2075,7 @@
                 <w:sz w:val="24"/>
                 <w:szCs w:val="24"/>
               </w:rPr>
-              <w:t xml:space="preserve">   525.00 </w:t>
+              <w:t>{{invoiceTotal}}</w:t>
             </w:r>
           </w:p>
         </w:tc>
@@ -3966,7 +2097,7 @@
         <w:jc w:val="center"/>
       </w:pPr>
       <w:r>
-        <w:t>[Name, Phone, email@address.com]</w:t>
+        <w:t>{{companyName}} | {{companyPhone}} | {{companyEmail}}</w:t>
       </w:r>
     </w:p>
     <w:sectPr>

</xml_diff>